<commit_message>
Apply v2.2 review fixes
</commit_message>
<xml_diff>
--- a/templates/contracts/supply_contract.docx
+++ b/templates/contracts/supply_contract.docx
@@ -129,7 +129,7 @@
         <w:br/>
         <w:t xml:space="preserve">{{ПОСТАВЩИК_ДИРЕКТОР_ФИО_РП}}, действующего на основании Устава, с одной стороны и </w:t>
         <w:br/>
-        <w:t>{{ПОКУПАТЕЛЬ_НАИМЕНОВАНИЕ}}, именуемый в дальнейшем «Заказчик», с другой стороны, заключили настоящий договор о нижеследующем:</w:t>
+        <w:t>{{ПОКУПАТЕЛЬ_НАИМЕНОВАНИЕ}}, именуемый в дальнейшем «Покупатель», с другой стороны, заключили настоящий договор о нижеследующем:</w:t>
       </w:r>
     </w:p>
     <w:p>
@@ -1167,7 +1167,7 @@
           <w:sz w:val="22"/>
           <w:szCs w:val="22"/>
         </w:rPr>
-        <w:t>{% for line in payment_lines %}{{line.text}}{% endfor %}</w:t>
+        <w:t>{{PAYMENT_SECTION}}</w:t>
       </w:r>
       <w:bookmarkStart w:id="0" w:name="_Hlk86833233"/>
       <w:bookmarkEnd w:id="0"/>
@@ -2203,87 +2203,7 @@
           <w:sz w:val="22"/>
           <w:szCs w:val="22"/>
         </w:rPr>
-        <w:t xml:space="preserve"> – Технические характеристики</w:t>
-      </w:r>
-      <w:r>
-        <w:rPr>
-          <w:rFonts w:ascii="Arial" w:hAnsi="Arial" w:cs="Arial"/>
-          <w:sz w:val="22"/>
-          <w:szCs w:val="22"/>
-        </w:rPr>
-        <w:t xml:space="preserve"> и комплект поставки </w:t>
-      </w:r>
-      <w:r>
-        <w:rPr>
-          <w:rFonts w:ascii="Arial" w:hAnsi="Arial" w:cs="Arial"/>
-          <w:sz w:val="22"/>
-          <w:szCs w:val="22"/>
-        </w:rPr>
-        <w:t xml:space="preserve">Весов </w:t>
-      </w:r>
-      <w:r>
-        <w:rPr>
-          <w:rFonts w:ascii="Arial" w:hAnsi="Arial" w:cs="Arial"/>
-          <w:sz w:val="22"/>
-          <w:szCs w:val="22"/>
-        </w:rPr>
-        <w:t>ВЕСТА-С</w:t>
-      </w:r>
-      <w:r>
-        <w:rPr>
-          <w:rFonts w:ascii="Arial" w:hAnsi="Arial" w:cs="Arial"/>
-          <w:sz w:val="22"/>
-          <w:szCs w:val="22"/>
-        </w:rPr>
-        <w:t>Л</w:t>
-      </w:r>
-      <w:r>
-        <w:rPr>
-          <w:rFonts w:ascii="Arial" w:hAnsi="Arial" w:cs="Arial"/>
-          <w:sz w:val="22"/>
-          <w:szCs w:val="22"/>
-        </w:rPr>
-        <w:t>-</w:t>
-      </w:r>
-      <w:r>
-        <w:rPr>
-          <w:rFonts w:ascii="Arial" w:hAnsi="Arial" w:cs="Arial"/>
-          <w:sz w:val="22"/>
-          <w:szCs w:val="22"/>
-        </w:rPr>
-        <w:t>8</w:t>
-      </w:r>
-      <w:r>
-        <w:rPr>
-          <w:rFonts w:ascii="Arial" w:hAnsi="Arial" w:cs="Arial"/>
-          <w:sz w:val="22"/>
-          <w:szCs w:val="22"/>
-        </w:rPr>
-        <w:t>0-</w:t>
-      </w:r>
-      <w:r>
-        <w:rPr>
-          <w:rFonts w:ascii="Arial" w:hAnsi="Arial" w:cs="Arial"/>
-          <w:sz w:val="22"/>
-          <w:szCs w:val="22"/>
-        </w:rPr>
-        <w:t>18</w:t>
-      </w:r>
-      <w:r>
-        <w:rPr>
-          <w:rFonts w:ascii="Arial" w:hAnsi="Arial" w:cs="Arial"/>
-          <w:sz w:val="22"/>
-          <w:szCs w:val="22"/>
-        </w:rPr>
-        <w:t>-Ц</w:t>
-      </w:r>
-      <w:r>
-        <w:rPr>
-          <w:rFonts w:ascii="Arial" w:hAnsi="Arial" w:cs="Arial"/>
-          <w:sz w:val="22"/>
-          <w:szCs w:val="22"/>
-        </w:rPr>
-        <w:t>.</w:t>
+        <w:t xml:space="preserve"> – Технические характеристики и комплект поставки {{ТОВАР_НАИМЕНОВАНИЕ}}</w:t>
       </w:r>
     </w:p>
     <w:p>
@@ -2790,7 +2710,7 @@
                 <w:sz w:val="22"/>
                 <w:szCs w:val="22"/>
               </w:rPr>
-              <w:t>ИНН {{ПОКУПАТЕЛЬ_ИНН}}</w:t>
+              <w:t>ИНН {{ПОКУПАТЕЛЬ_ИНН}}{% if ПОКУПАТЕЛЬ_КПП %} КПП {{ПОКУПАТЕЛЬ_КПП}}{% endif %}</w:t>
             </w:r>
           </w:p>
           <w:p>

</xml_diff>